<commit_message>
Update LinkedIn URL to linkedin.com/in/katie-kinkel
Point site content, docs, and regenerated resumes at the current profile slug so the old katie-k-92602250 URL no longer appears.

Co-authored-by: Cursor <cursoragent@cursor.com>
</commit_message>
<xml_diff>
--- a/public/Katie-Kinkel-AI-QA-Resume.docx
+++ b/public/Katie-Kinkel-AI-QA-Resume.docx
@@ -34,7 +34,7 @@
       <w:pPr>
         <w:spacing w:after="80" w:before="0"/>
       </w:pPr>
-      <w:hyperlink w:history="1" r:id="rIdqyxfw0lipyd-g3tembkyx">
+      <w:hyperlink w:history="1" r:id="rIdhfifyv5ji4orddj63ldk2">
         <w:r>
           <w:rPr>
             <w:color w:val="3B7A68"/>
@@ -53,7 +53,7 @@
         </w:rPr>
         <w:t xml:space="preserve">   ·   </w:t>
       </w:r>
-      <w:hyperlink w:history="1" r:id="rIdrn0jinbezaoyhs3h71h4e">
+      <w:hyperlink w:history="1" r:id="rIdhejew7qfx0fzg3xkbu9sh">
         <w:r>
           <w:rPr>
             <w:color w:val="3B7A68"/>
@@ -72,7 +72,7 @@
         </w:rPr>
         <w:t xml:space="preserve">   ·   </w:t>
       </w:r>
-      <w:hyperlink w:history="1" r:id="rIdchx2ail-ltko7sf9s9ftp">
+      <w:hyperlink w:history="1" r:id="rIdwweckhuczztqh9w4ofo5a">
         <w:r>
           <w:rPr>
             <w:color w:val="3B7A68"/>

</xml_diff>

<commit_message>
fix: date AI work from 2025; keep Spotify as human QA
Stop implying LLM/AI use before 2025 by shifting the independent AI role, labeling AI case studies as 2025+, and clarifying Spotify/24-7 Intouch as human QA only.
</commit_message>
<xml_diff>
--- a/public/Katie-Kinkel-AI-QA-Resume.docx
+++ b/public/Katie-Kinkel-AI-QA-Resume.docx
@@ -34,7 +34,7 @@
       <w:pPr>
         <w:spacing w:after="80" w:before="0"/>
       </w:pPr>
-      <w:hyperlink w:history="1" r:id="rIdlwqdar-6zb4tugsk63ttg">
+      <w:hyperlink w:history="1" r:id="rIdosmoizitbdbsqnlg5ssnz">
         <w:r>
           <w:rPr>
             <w:color w:val="3B7A68"/>
@@ -53,7 +53,7 @@
         </w:rPr>
         <w:t xml:space="preserve">   ·   </w:t>
       </w:r>
-      <w:hyperlink w:history="1" r:id="rIdmf2nribdwdmk8jdyv7dwe">
+      <w:hyperlink w:history="1" r:id="rIdym_wgxezfsl7limo-xxk6">
         <w:r>
           <w:rPr>
             <w:color w:val="3B7A68"/>
@@ -72,7 +72,7 @@
         </w:rPr>
         <w:t xml:space="preserve">   ·   </w:t>
       </w:r>
-      <w:hyperlink w:history="1" r:id="rIduruspay2lhdmddltryuax">
+      <w:hyperlink w:history="1" r:id="rIdfj_xsyobf6mro5vfcpzlc">
         <w:r>
           <w:rPr>
             <w:color w:val="3B7A68"/>
@@ -217,7 +217,7 @@
           <w:sz w:val="17"/>
           <w:szCs w:val="17"/>
         </w:rPr>
-        <w:t xml:space="preserve">  ·  Remote  ·  2022 – Present</w:t>
+        <w:t xml:space="preserve">  ·  Remote  ·  2025 – Present</w:t>
       </w:r>
     </w:p>
     <w:p>
@@ -257,7 +257,7 @@
           <w:sz w:val="20"/>
           <w:szCs w:val="20"/>
         </w:rPr>
-        <w:t xml:space="preserve">Creative Support / QA Buddy</w:t>
+        <w:t xml:space="preserve">Independent community &amp; operations support</w:t>
       </w:r>
       <w:r>
         <w:rPr>
@@ -265,6 +265,41 @@
           <w:sz w:val="17"/>
           <w:szCs w:val="17"/>
         </w:rPr>
+        <w:t xml:space="preserve">  ·  Remote  ·  2022 – 2025</w:t>
+      </w:r>
+    </w:p>
+    <w:p>
+      <w:pPr>
+        <w:spacing w:after="40" w:before="40"/>
+      </w:pPr>
+      <w:r>
+        <w:rPr>
+          <w:color w:val="5B6B66"/>
+          <w:sz w:val="18"/>
+          <w:szCs w:val="18"/>
+        </w:rPr>
+        <w:t xml:space="preserve">•  Neighborhood association minutes, rescue coordination, outreach, and support communications — without AI tools.</w:t>
+      </w:r>
+    </w:p>
+    <w:p>
+      <w:pPr>
+        <w:spacing w:after="20" w:before="120"/>
+      </w:pPr>
+      <w:r>
+        <w:rPr>
+          <w:b/>
+          <w:bCs/>
+          <w:sz w:val="20"/>
+          <w:szCs w:val="20"/>
+        </w:rPr>
+        <w:t xml:space="preserve">Creative Support / QA Buddy</w:t>
+      </w:r>
+      <w:r>
+        <w:rPr>
+          <w:color w:val="5B6B66"/>
+          <w:sz w:val="17"/>
+          <w:szCs w:val="17"/>
+        </w:rPr>
         <w:t xml:space="preserve">  ·  24-7 Intouch / Spotify  ·  2019 – 2022</w:t>
       </w:r>
     </w:p>
@@ -291,7 +326,7 @@
           <w:sz w:val="18"/>
           <w:szCs w:val="18"/>
         </w:rPr>
-        <w:t xml:space="preserve">•  3+ years Spotify support program via 24-7 Intouch (Creative Support L3 → QA Buddy).</w:t>
+        <w:t xml:space="preserve">•  3+ years Spotify support via 24-7 Intouch (Creative Support L3 → QA Buddy). Human QA only — no AI in this role.</w:t>
       </w:r>
     </w:p>
     <w:p>

</xml_diff>